<commit_message>
docs: update thesis wording and add submission manual
</commit_message>
<xml_diff>
--- a/thesis/thesis_submission.docx
+++ b/thesis/thesis_submission.docx
@@ -267,7 +267,7 @@
         <w:pStyle w:val="3"/>
       </w:pPr>
       <w:r>
-        <w:t>基于中国医师资格考试数据集 CMExam，本文构建了牙科选择题评测基准，并提出面向五选一任务的 Choice-Head 两阶段蒸馏框架。该方法不再对全词表 logits 进行蒸馏，而是直接学习 A/B/C/D/E 五个候选选项上的概率分布，因此既能兼容黑盒 API 教师，也能显著降低显存与计算开销。围绕该框架，本文完成了 21 组系统性实验，并得到四项核心结论：第一，Qwen2.5-14B 学生模型在 991 题全量测试集上达到 89.10% 最佳准确率，3-seed 均值为 88.67%，超过 DeepSeek-V3 教师的 87.18%，说明在 45 倍参数压缩条件下仍可实现性能反超；第二，教师质量与蒸馏收益呈倒 U 型关系，较高准确率且保留适度 teacher-GT 分歧的教师更容易提供有效蒸馏信号；第三，基于 Fisher-Rao 距离与 α-散度的分析表明，真实 logprobs 标签较人工平滑标签保留了更丰富的连续结构信息，其体积密度高约 2500 倍；第四，异构教师同样可以提供有效蒸馏信号，72.45% 准确率的 Llama-3.3-70B 教师仍能蒸馏出达到 87.25% 的 14B 学生模型。</w:t>
+        <w:t>基于中国医师资格考试数据集 CMExam，本文面向牙科五选一选择题任务构建了可复现的评测设置，并在此基础上提出了 Choice-Head 两阶段蒸馏框架。该方法不再对全词表 logits 进行蒸馏，而是直接学习 A/B/C/D/E 五个候选选项上的概率分布，因此既能兼容黑盒 API 教师，也能显著降低显存与计算开销。围绕该框架，本文完成了 21 组系统性实验，并得到四项核心结论：第一，Qwen2.5-14B 学生模型在 991 题全量测试集上达到 89.10% 最佳准确率，3-seed 均值为 88.67%，超过 DeepSeek-V3 教师的 87.18%，说明在 45 倍参数压缩条件下仍可实现性能反超；第二，教师质量与蒸馏收益呈倒 U 型关系，较高准确率且保留适度 teacher-GT 分歧的教师更容易提供有效蒸馏信号；第三，基于 Fisher-Rao 距离与 α-散度的分析表明，真实 logprobs 标签较人工平滑标签保留了更丰富的连续结构信息，其体积密度高约 2500 倍；第四，异构教师同样可以提供有效蒸馏信号，72.45% 准确率的 Llama-3.3-70B 教师仍能蒸馏出达到 87.25% 的 14B 学生模型。</w:t>
       </w:r>
     </w:p>
     <w:p>
@@ -316,7 +316,7 @@
         <w:pStyle w:val="3"/>
       </w:pPr>
       <w:r>
-        <w:t>Based on the Chinese Medical Examination dataset CMExam, this study builds a dental multiple-choice benchmark and proposes a Choice-Head two-stage distillation framework tailored to five-option questions. Instead of distilling full-vocabulary logits, the framework directly learns the probability distribution over options A/B/C/D/E, which both preserves task-relevant supervisory signals and remains compatible with black-box API teachers while substantially reducing memory overhead. Across 21 systematic experiments, four main findings are obtained. First, a Qwen2.5-14B student reaches 89.10% best accuracy on the 991-question full test set, with an 88.67% three-seed mean, exceeding the DeepSeek-V3 teacher’s 87.18% under 45× parameter compression. Second, teacher quality shows an inverted-U relationship with distillation gain, and teachers with relatively high accuracy while preserving moderate teacher-GT disagreement are more likely to provide effective distillation signals. Third, analyses based on Fisher-Rao distance and the α-divergence family show that real logprobs retain much richer continuous structure than manually smoothed labels, with approximately 2,500 times higher volume density. Fourth, useful distillation remains possible across architectures: a Llama-3.3-70B teacher with 72.45% accuracy can still produce a 14B student reaching 87.25%.</w:t>
+        <w:t>Based on the Chinese Medical Examination dataset CMExam, this study establishes a reproducible evaluation setup for dental five-option multiple-choice questions and, on this basis, proposes a Choice-Head two-stage distillation framework. Instead of distilling full-vocabulary logits, the framework directly learns the probability distribution over options A/B/C/D/E, which both preserves task-relevant supervisory signals and remains compatible with black-box API teachers while substantially reducing memory overhead. Across 21 systematic experiments, four main findings are obtained. First, a Qwen2.5-14B student reaches 89.10% best accuracy on the 991-question full test set, with an 88.67% three-seed mean, exceeding the DeepSeek-V3 teacher’s 87.18% under 45× parameter compression. Second, teacher quality shows an inverted-U relationship with distillation gain, and teachers with relatively high accuracy while preserving moderate teacher-GT disagreement are more likely to provide effective distillation signals. Third, analyses based on Fisher-Rao distance and the α-divergence family show that real logprobs retain much richer continuous structure than manually smoothed labels, with approximately 2,500 times higher volume density. Fourth, useful distillation remains possible across architectures: a Llama-3.3-70B teacher with 72.45% accuracy can still produce a 14B student reaching 87.25%.</w:t>
       </w:r>
     </w:p>
     <w:p>
@@ -1188,7 +1188,7 @@
         <w:pStyle w:val="3"/>
       </w:pPr>
       <w:r>
-        <w:t>围绕这一总体目标，本文设置了四项具体任务：（1）基于 CMExam 数据集建立标准化牙科选择题评测基准；（2）设计并验证 Choice-Head 蒸馏框架，使其同时兼容黑盒 API 教师与白盒本地教师；（3）分析学生模型在不同教师、不同训练阶段和不同数据规模下的性能变化，并验证学生超越教师的条件；（4）实现可交互的牙科问答原型系统，为后续教学演示、考试训练与方法验证提供接口基础。</w:t>
+        <w:t>围绕这一总体目标，本文设置了四项具体任务：（1）基于 CMExam 数据集建立面向牙科选择题任务的数据划分与评测设置；（2）设计并验证 Choice-Head 蒸馏框架，使其同时兼容黑盒 API 教师与白盒本地教师；（3）分析学生模型在不同教师、不同训练阶段和不同数据规模下的性能变化，并验证学生超越教师的条件；（4）实现可交互的牙科问答原型系统，为后续教学演示、考试训练与方法验证提供接口基础。</w:t>
       </w:r>
     </w:p>
     <w:bookmarkEnd w:id="29"/>
@@ -1382,7 +1382,7 @@
         <w:pStyle w:val="3"/>
       </w:pPr>
       <w:r>
-        <w:t xml:space="preserve">近年来，医学大语言模型的评测基准也取得了重要进展。CMExam 收录了中国执业医师资格考试真题，涵盖多个临床学科，以标准化选择题形式提供客观、可量化的评估方案[10]。MedQA 和 PubMedQA 等英文数据集也为医疗 AI 的性能评估提供了标准化基准[11,12]。本研究选用 CMExam 的牙科子集作为评测基准，既保证了题目的专业性和权威性，又支持精确匹配准确率的客观评估[10]。</w:t>
+        <w:t>近年来，医学大语言模型的评测基准也取得了重要进展。CMExam 收录了中国执业医师资格考试真题，涵盖多个临床学科，以标准化选择题形式提供客观、可量化的评估方案[10]。MedQA 和 PubMedQA 等英文数据集也为医疗 AI 的性能评估提供了标准化基准[11,12]。本研究选用 CMExam 的牙科子集作为主要评测对象，既保证了题目的专业性和权威性，又支持基于准确率的客观评估[10]。</w:t>
       </w:r>
     </w:p>
     <w:p>
@@ -1508,7 +1508,7 @@
         <w:pStyle w:val="3"/>
       </w:pPr>
       <w:r>
-        <w:t xml:space="preserve">在这种背景下，任务结构本身就成为重新定义蒸馏目标的依据。对于五选一医学选择题，教师需要传递给学生的信息并不在于完整词表上的概率细节，而在于五个候选项之间的相对支持关系。只要能够恢复这种选项级分布，无论教师来自本地模型还是 API 服务，都有可能形成有效监督。本文提出的 Choice-Head 蒸馏正是沿着这一思路，将蒸馏问题从通用 token 分布匹配改写为任务头层面的决策分布迁移。</w:t>
+        <w:t>在这种背景下，任务结构本身就成为重新定义蒸馏目标的依据。对于五选一医学选择题，教师需要传递给学生的信息并不在于完整词表上的概率细节，而在于五个候选项之间的相对支持关系。只要能够恢复这种选项级分布，无论教师来自本地模型还是 API 服务，都有可能形成有效监督。基于这一思路，本文将蒸馏问题从通用 token 分布匹配改写为任务头层面的决策分布迁移，并提出了 Choice-Head 蒸馏方法。</w:t>
       </w:r>
     </w:p>
     <w:p>
@@ -1524,19 +1524,19 @@
         <w:pStyle w:val="3"/>
       </w:pPr>
       <w:r>
-        <w:t xml:space="preserve">当前蒸馏研究还面临一个经常被忽视的问题，即</w:t>
-      </w:r>
-      <w:r>
-        <w:t xml:space="preserve">“</w:t>
-      </w:r>
-      <w:r>
-        <w:t xml:space="preserve">教师信息到底以什么形式最值得被学生继承</w:t>
-      </w:r>
-      <w:r>
-        <w:t xml:space="preserve">”</w:t>
-      </w:r>
-      <w:r>
-        <w:t xml:space="preserve">。在传统分类任务中，类别数固定且较少，软标签天然能够表达类别相似性；但在大语言模型任务中，完整词表分布既极高维，又包含大量与当前任务无关的 token。若不先识别出真正承载决策信息的结构，蒸馏就容易退化为高成本的噪声传递。Choice-Head 的出发点正在于此：对于五选一医学选择题，真正需要迁移的不是整个语言生成空间，而是教师如何在有限候选项之间分配支持度。这一判断既是本文方法设计的起点，也是后续实验解释的主线。</w:t>
+        <w:t>当前蒸馏研究还面临一个经常被忽视的问题，即</w:t>
+      </w:r>
+      <w:r>
+        <w:t>教</w:t>
+      </w:r>
+      <w:r>
+        <w:t>师信息应以何种形式被学生继承，才能最大</w:t>
+      </w:r>
+      <w:r>
+        <w:t>程</w:t>
+      </w:r>
+      <w:r>
+        <w:t>度保留对任务决策有用的结构信息。在传统分类任务中，类别数固定且较少，软标签天然能够表达类别相似性；但在大语言模型任务中，完整词表分布既极高维，又包含大量与当前任务无关的 token。若不先识别出真正承载决策信息的结构，蒸馏就容易退化为高成本的噪声传递。Choice-Head 的出发点正在于此：对于五选一医学选择题，真正需要迁移的不是整个语言生成空间，而是教师如何在有限候选项之间分配支持度。这一判断既是本文方法设计的起点，也是后续实验解释的主线。</w:t>
       </w:r>
     </w:p>
     <w:p>

</xml_diff>